<commit_message>
Added App01/How to Export PDF
</commit_message>
<xml_diff>
--- a/worksheet/04_generalization.docx
+++ b/worksheet/04_generalization.docx
@@ -158,7 +158,7 @@
     <w:p>
       <w:pPr>
         <w:rPr>
-          <w:rFonts w:ascii="Cambria" w:hAnsi="Cambria" w:cs="Cambria"/>
+          <w:rFonts w:ascii="Cambria" w:hAnsi="Cambria" w:cs="Cambria" w:hint="eastAsia"/>
         </w:rPr>
       </w:pPr>
       <w:r>
@@ -501,7 +501,7 @@
       <w:rPr>
         <w:rFonts w:hint="eastAsia"/>
       </w:rPr>
-      <w:t>反証可能性</w:t>
+      <w:t>説明と一般化</w:t>
     </w:r>
     <w:r>
       <w:rPr>

</xml_diff>